<commit_message>
Update 'CreazioneAuleStudio' scenario table
</commit_message>
<xml_diff>
--- a/Documentation/Documentazione.docx
+++ b/Documentation/Documentazione.docx
@@ -444,69 +444,19 @@
     <w:p>
       <w:pPr>
         <w:rPr>
-          <w:b/>
-          <w:bCs/>
+          <w:b w:val="1"/>
+          <w:bCs w:val="1"/>
           <w:color w:val="659ED5"/>
           <w:sz w:val="28"/>
-          <w:szCs w:val="21"/>
+          <w:szCs w:val="28"/>
         </w:rPr>
       </w:pPr>
     </w:p>
     <w:p>
-      <w:pPr>
-        <w:rPr>
-          <w:b/>
-          <w:bCs/>
-          <w:color w:val="659ED5"/>
-          <w:sz w:val="28"/>
-          <w:szCs w:val="21"/>
-        </w:rPr>
-      </w:pPr>
+      <w:r>
+        <w:br w:type="page"/>
+      </w:r>
     </w:p>
-    <w:p>
-      <w:pPr>
-        <w:rPr>
-          <w:b/>
-          <w:bCs/>
-          <w:color w:val="659ED5"/>
-          <w:sz w:val="28"/>
-          <w:szCs w:val="21"/>
-        </w:rPr>
-      </w:pPr>
-    </w:p>
-    <w:p>
-      <w:pPr>
-        <w:rPr>
-          <w:b/>
-          <w:bCs/>
-          <w:color w:val="659ED5"/>
-          <w:sz w:val="28"/>
-          <w:szCs w:val="21"/>
-        </w:rPr>
-      </w:pPr>
-    </w:p>
-    <w:p>
-      <w:pPr>
-        <w:rPr>
-          <w:b/>
-          <w:bCs/>
-          <w:color w:val="659ED5"/>
-          <w:sz w:val="28"/>
-          <w:szCs w:val="21"/>
-        </w:rPr>
-      </w:pPr>
-    </w:p>
-    <w:p>
-      <w:pPr>
-        <w:rPr>
-          <w:sz w:val="32"/>
-          <w:szCs w:val="22"/>
-        </w:rPr>
-      </w:pPr>
-    </w:p>
-    <w:p/>
-    <w:p/>
-    <w:p/>
     <w:p>
       <w:pPr>
         <w:shd w:val="clear" w:color="auto" w:fill="F37A41"/>
@@ -20106,7 +20056,7 @@
                 <w:szCs w:val="22"/>
                 <w:lang w:val="it-IT"/>
               </w:rPr>
-              <w:t>Il sistema verifica che non esista già una Sala Studio con lo stesso nome/identificativo.</w:t>
+              <w:t>Il sistema crea la nuova Sala Studio, con le relative Postazioni e le eventuali Aree specificate.</w:t>
             </w:r>
           </w:p>
           <w:p>
@@ -20131,7 +20081,7 @@
                 <w:szCs w:val="22"/>
                 <w:lang w:val="it-IT"/>
               </w:rPr>
-              <w:t>Il sistema crea la nuova Sala Studio e la salva nel database, rendendola operativa per le prenotazioni.</w:t>
+              <w:t>Il sistema verifica che non esista già una Sala Studio con lo stesso nome/identificativo e, se il controllo ha esito positivo, registra la sala rendendola operativa per le prenotazioni.</w:t>
             </w:r>
           </w:p>
           <w:p>
@@ -20343,6 +20293,9 @@
           </w:tcPr>
           <w:p>
             <w:pPr>
+              <w:pStyle w:val="Normale"/>
+            </w:pPr>
+            <w:r>
               <w:rPr>
                 <w:rFonts w:ascii="Times New Roman" w:hAnsi="Times New Roman" w:eastAsia="Times New Roman" w:cs="Times New Roman"/>
                 <w:noProof w:val="0"/>
@@ -20350,6 +20303,12 @@
                 <w:szCs w:val="22"/>
                 <w:lang w:val="it-IT"/>
               </w:rPr>
+              <w:t xml:space="preserve">Al punto 5, se i dati inseriti non sono validi (es. numero postazioni negativo o orari incoerenti), il sistema restituisce un messaggio di errore e invita il Bibliotecario a correggere i campi. </w:t>
+            </w:r>
+          </w:p>
+          <w:p>
+            <w:pPr>
+              <w:pStyle w:val="Normale"/>
             </w:pPr>
             <w:r>
               <w:rPr>
@@ -20359,29 +20318,7 @@
                 <w:szCs w:val="22"/>
                 <w:lang w:val="it-IT"/>
               </w:rPr>
-              <w:t>Al punto 5, se i dati inseriti non sono validi (es. numero postazioni negativo o orari incoerenti), il sistema restituisce un messaggio di errore e invita il Bibliotecario a correggere i campi.</w:t>
-            </w:r>
-          </w:p>
-          <w:p>
-            <w:pPr>
-              <w:pStyle w:val="Normale"/>
-              <w:rPr>
-                <w:rFonts w:ascii="Times New Roman" w:hAnsi="Times New Roman" w:eastAsia="Times New Roman" w:cs="Times New Roman"/>
-                <w:noProof w:val="0"/>
-                <w:sz w:val="22"/>
-                <w:szCs w:val="22"/>
-                <w:lang w:val="it-IT"/>
-              </w:rPr>
-            </w:pPr>
-            <w:r>
-              <w:rPr>
-                <w:rFonts w:ascii="Times New Roman" w:hAnsi="Times New Roman" w:eastAsia="Times New Roman" w:cs="Times New Roman"/>
-                <w:noProof w:val="0"/>
-                <w:sz w:val="22"/>
-                <w:szCs w:val="22"/>
-                <w:lang w:val="it-IT"/>
-              </w:rPr>
-              <w:t>Al punto 6, se esiste già una Sala Studio con lo stesso nome/identificativo, il sistema restituisce un messaggio di errore e la creazione non viene effettuata.</w:t>
+              <w:t>Al punto 7, se esiste già una Sala Studio con lo stesso nome/identificativo, il sistema restituisce un messaggio di errore e la sala non viene registrata né resa disponibile per le prenotazioni.</w:t>
             </w:r>
           </w:p>
         </w:tc>

</xml_diff>

<commit_message>
update 'MonitoraggioSale' sequence diagram
</commit_message>
<xml_diff>
--- a/Documentation/Documentazione.docx
+++ b/Documentation/Documentazione.docx
@@ -32027,10 +32027,10 @@
       </w:pPr>
       <w:r>
         <w:drawing>
-          <wp:inline wp14:editId="698BF862" wp14:anchorId="292FFB7A">
-            <wp:extent cx="4572000" cy="5306491"/>
+          <wp:inline wp14:editId="73234092" wp14:anchorId="69BEAB81">
+            <wp:extent cx="4572000" cy="4835191"/>
             <wp:effectExtent l="0" t="0" r="0" b="0"/>
-            <wp:docPr id="891713446" name="drawing"/>
+            <wp:docPr id="1239856288" name="drawing"/>
             <wp:cNvGraphicFramePr>
               <a:graphicFrameLocks noChangeAspect="1"/>
             </wp:cNvGraphicFramePr>
@@ -32038,11 +32038,11 @@
               <a:graphicData xmlns:a="http://schemas.openxmlformats.org/drawingml/2006/main" uri="http://schemas.openxmlformats.org/drawingml/2006/picture">
                 <pic:pic xmlns:pic="http://schemas.openxmlformats.org/drawingml/2006/picture">
                   <pic:nvPicPr>
-                    <pic:cNvPr id="891713446" name="Picture 891713446"/>
+                    <pic:cNvPr id="1239856288" name="Picture 1239856288"/>
                     <pic:cNvPicPr/>
                   </pic:nvPicPr>
                   <pic:blipFill>
-                    <a:blip xmlns:r="http://schemas.openxmlformats.org/officeDocument/2006/relationships" r:embed="rId1243912681">
+                    <a:blip xmlns:r="http://schemas.openxmlformats.org/officeDocument/2006/relationships" r:embed="rId1474766998">
                       <a:extLst>
                         <a:ext uri="{28A0092B-C50C-407E-A947-70E740481C1C}">
                           <a14:useLocalDpi xmlns:a14="http://schemas.microsoft.com/office/drawing/2010/main"/>
@@ -32056,7 +32056,7 @@
                   <pic:spPr>
                     <a:xfrm rot="0">
                       <a:off x="0" y="0"/>
-                      <a:ext cx="4572000" cy="5306491"/>
+                      <a:ext cx="4572000" cy="4835191"/>
                     </a:xfrm>
                     <a:prstGeom prst="rect">
                       <a:avLst/>

</xml_diff>